<commit_message>
fix bugs in 2nd alg
</commit_message>
<xml_diff>
--- a/docs/ТЗ_Blooming.docx
+++ b/docs/ТЗ_Blooming.docx
@@ -2046,9 +2046,6 @@
     <w:p>
       <w:pPr>
         <w:pStyle w:val="Textbody"/>
-        <w:rPr>
-          <w:lang w:val="en-US"/>
-        </w:rPr>
       </w:pPr>
       <w:r>
         <w:t>Раздел «Требования к программной документации» содержит предварительный состав программной документации, а также специальные требования к ней.</w:t>
@@ -2057,9 +2054,6 @@
     <w:p>
       <w:pPr>
         <w:pStyle w:val="Textbody"/>
-        <w:rPr>
-          <w:lang w:val="en-US"/>
-        </w:rPr>
       </w:pPr>
     </w:p>
     <w:p>
@@ -15775,7 +15769,6 @@
       <w:r>
         <w:rPr>
           <w:rFonts w:ascii="Times New Roman" w:hAnsi="Times New Roman" w:cs="Times New Roman"/>
-          <w:lang w:val="en-US"/>
         </w:rPr>
         <w:t>13</w:t>
       </w:r>
@@ -18674,7 +18667,25 @@
                 <w:kern w:val="0"/>
                 <w:lang w:eastAsia="ru-RU" w:bidi="ar-SA"/>
               </w:rPr>
-              <w:t>Несколько источников и стоков одновременно</w:t>
+              <w:t xml:space="preserve">Несколько </w:t>
+            </w:r>
+            <w:r>
+              <w:rPr>
+                <w:rFonts w:eastAsia="Times New Roman" w:cs="Times New Roman"/>
+                <w:color w:val="202020"/>
+                <w:kern w:val="0"/>
+                <w:lang w:eastAsia="ru-RU" w:bidi="ar-SA"/>
+              </w:rPr>
+              <w:t>истоков</w:t>
+            </w:r>
+            <w:r>
+              <w:rPr>
+                <w:rFonts w:eastAsia="Times New Roman" w:cs="Times New Roman"/>
+                <w:color w:val="202020"/>
+                <w:kern w:val="0"/>
+                <w:lang w:eastAsia="ru-RU" w:bidi="ar-SA"/>
+              </w:rPr>
+              <w:t xml:space="preserve"> и стоков одновременно</w:t>
             </w:r>
           </w:p>
         </w:tc>
@@ -19134,6 +19145,7 @@
         <w:textAlignment w:val="auto"/>
         <w:rPr>
           <w:rFonts w:ascii="Times New Roman" w:hAnsi="Times New Roman" w:cs="Times New Roman"/>
+          <w:lang w:val="en-US"/>
         </w:rPr>
       </w:pPr>
       <w:r>
@@ -19142,16 +19154,6 @@
         </w:rPr>
         <w:br w:type="page"/>
       </w:r>
-    </w:p>
-    <w:p>
-      <w:pPr>
-        <w:pStyle w:val="a7"/>
-        <w:ind w:left="357"/>
-        <w:outlineLvl w:val="0"/>
-        <w:rPr>
-          <w:rFonts w:ascii="Times New Roman" w:hAnsi="Times New Roman" w:cs="Times New Roman"/>
-        </w:rPr>
-      </w:pPr>
     </w:p>
     <w:p>
       <w:pPr>
@@ -19173,6 +19175,7 @@
           <w:rFonts w:ascii="Times New Roman" w:hAnsi="Times New Roman" w:cs="Times New Roman"/>
           <w:b/>
         </w:rPr>
+        <w:lastRenderedPageBreak/>
         <w:t>С</w:t>
       </w:r>
       <w:r>

</xml_diff>